<commit_message>
Align Group 15 contribution identities across reports and configuration
</commit_message>
<xml_diff>
--- a/report/cloud-review/CCZG506_Assignment1_Review.docx
+++ b/report/cloud-review/CCZG506_Assignment1_Review.docx
@@ -344,7 +344,7 @@
               <w:rPr>
                 <w:sz w:val="18"/>
               </w:rPr>
-              <w:t>2025NT03083</w:t>
+              <w:t>2025MT03071</w:t>
             </w:r>
           </w:p>
         </w:tc>
@@ -375,7 +375,7 @@
               <w:rPr>
                 <w:sz w:val="18"/>
               </w:rPr>
-              <w:t>Ajeet Kumar Yadav</w:t>
+              <w:t>Soumyajyoti Biswas</w:t>
             </w:r>
           </w:p>
         </w:tc>
@@ -602,7 +602,7 @@
               <w:rPr>
                 <w:sz w:val="18"/>
               </w:rPr>
-              <w:t>2025MT03071</w:t>
+              <w:t>2025NT03083</w:t>
             </w:r>
           </w:p>
         </w:tc>
@@ -633,7 +633,7 @@
               <w:rPr>
                 <w:sz w:val="18"/>
               </w:rPr>
-              <w:t>Soumyajyoti Biswas</w:t>
+              <w:t>Ajeet Kumar Yadav</w:t>
             </w:r>
           </w:p>
         </w:tc>

</xml_diff>